<commit_message>
Second Response added - Discussion Week10
</commit_message>
<xml_diff>
--- a/WK10_Discussion.docx
+++ b/WK10_Discussion.docx
@@ -471,7 +471,6 @@
       <w:pPr>
         <w:pStyle w:val="NormalWeb"/>
         <w:spacing w:before="180" w:beforeAutospacing="0" w:after="180" w:afterAutospacing="0" w:line="480" w:lineRule="auto"/>
-        <w:jc w:val="both"/>
         <w:rPr>
           <w:color w:val="444444"/>
         </w:rPr>
@@ -550,7 +549,6 @@
       <w:pPr>
         <w:pStyle w:val="NormalWeb"/>
         <w:spacing w:before="0" w:beforeAutospacing="0" w:after="0" w:afterAutospacing="0" w:line="480" w:lineRule="auto"/>
-        <w:jc w:val="both"/>
         <w:rPr>
           <w:color w:val="444444"/>
         </w:rPr>
@@ -588,19 +586,7 @@
           <w:rPr>
             <w:rStyle w:val="Hyperlink"/>
           </w:rPr>
-          <w:t xml:space="preserve"> to an</w:t>
-        </w:r>
-        <w:r>
-          <w:rPr>
-            <w:rStyle w:val="Hyperlink"/>
-          </w:rPr>
-          <w:t xml:space="preserve"> </w:t>
-        </w:r>
-        <w:r>
-          <w:rPr>
-            <w:rStyle w:val="Hyperlink"/>
-          </w:rPr>
-          <w:t xml:space="preserve">external </w:t>
+          <w:t xml:space="preserve"> to an external </w:t>
         </w:r>
         <w:proofErr w:type="spellStart"/>
         <w:proofErr w:type="gramStart"/>
@@ -807,38 +793,254 @@
       <w:pPr>
         <w:pStyle w:val="NormalWeb"/>
         <w:spacing w:before="180" w:beforeAutospacing="0" w:after="180" w:afterAutospacing="0" w:line="480" w:lineRule="auto"/>
+        <w:rPr>
+          <w:color w:val="444444"/>
+        </w:rPr>
+      </w:pPr>
+      <w:proofErr w:type="spellStart"/>
+      <w:r>
+        <w:rPr>
+          <w:color w:val="444444"/>
+        </w:rPr>
+        <w:t>Ravinetto</w:t>
+      </w:r>
+      <w:proofErr w:type="spellEnd"/>
+      <w:r>
+        <w:rPr>
+          <w:color w:val="444444"/>
+        </w:rPr>
+        <w:t>, R., &amp; Singh, J. A. (2023b, June). </w:t>
+      </w:r>
+      <w:r>
+        <w:rPr>
+          <w:rStyle w:val="Emphasis"/>
+          <w:color w:val="444444"/>
+        </w:rPr>
+        <w:t>Responsible dissemination of health and medical research: Some guidance points</w:t>
+      </w:r>
+      <w:r>
+        <w:rPr>
+          <w:color w:val="444444"/>
+        </w:rPr>
+        <w:t xml:space="preserve">. BMJ evidence-based medicine. </w:t>
+      </w:r>
+      <w:hyperlink r:id="rId8" w:history="1">
+        <w:r>
+          <w:rPr>
+            <w:rStyle w:val="Hyperlink"/>
+          </w:rPr>
+          <w:t>https://pmc.ncbi.nlm.nih.gov/articles/PMC10313982/</w:t>
+        </w:r>
+      </w:hyperlink>
+    </w:p>
+    <w:p>
+      <w:pPr>
+        <w:pStyle w:val="NormalWeb"/>
+        <w:spacing w:before="180" w:beforeAutospacing="0" w:after="180" w:afterAutospacing="0" w:line="480" w:lineRule="auto"/>
+        <w:rPr>
+          <w:color w:val="444444"/>
+        </w:rPr>
+      </w:pPr>
+    </w:p>
+    <w:p>
+      <w:pPr>
+        <w:pStyle w:val="NormalWeb"/>
+        <w:spacing w:before="180" w:beforeAutospacing="0" w:after="180" w:afterAutospacing="0" w:line="480" w:lineRule="auto"/>
         <w:jc w:val="both"/>
         <w:rPr>
           <w:color w:val="444444"/>
         </w:rPr>
       </w:pPr>
+      <w:r>
+        <w:rPr>
+          <w:color w:val="444444"/>
+        </w:rPr>
+        <w:t>Response 2</w:t>
+      </w:r>
+    </w:p>
+    <w:p>
+      <w:pPr>
+        <w:pStyle w:val="NormalWeb"/>
+        <w:spacing w:before="180" w:beforeAutospacing="0" w:after="180" w:afterAutospacing="0" w:line="480" w:lineRule="auto"/>
+        <w:jc w:val="both"/>
+        <w:rPr>
+          <w:color w:val="444444"/>
+        </w:rPr>
+      </w:pPr>
+      <w:r>
+        <w:rPr>
+          <w:color w:val="444444"/>
+        </w:rPr>
+        <w:t xml:space="preserve">Hello </w:t>
+      </w:r>
       <w:proofErr w:type="spellStart"/>
       <w:r>
         <w:rPr>
           <w:color w:val="444444"/>
         </w:rPr>
-        <w:t>Ravinetto</w:t>
+        <w:t>Arit</w:t>
       </w:r>
       <w:proofErr w:type="spellEnd"/>
       <w:r>
         <w:rPr>
           <w:color w:val="444444"/>
         </w:rPr>
-        <w:t>, R., &amp; Singh, J. A. (2023b, June). </w:t>
+        <w:t>,</w:t>
+      </w:r>
+    </w:p>
+    <w:p>
+      <w:pPr>
+        <w:pStyle w:val="NormalWeb"/>
+        <w:spacing w:before="180" w:beforeAutospacing="0" w:after="180" w:afterAutospacing="0" w:line="480" w:lineRule="auto"/>
+        <w:jc w:val="both"/>
+        <w:rPr>
+          <w:color w:val="444444"/>
+        </w:rPr>
+      </w:pPr>
+      <w:r>
+        <w:rPr>
+          <w:color w:val="444444"/>
+        </w:rPr>
+        <w:t>Methods you have mentioned together will ensure that evidence-based outcomes, such as reduced medication errors and increased user satisfaction, are not only communicated effectively but also used to drive sustainable improvements in patient safety, system efficiency, and equitable healthcare delivery</w:t>
+      </w:r>
+    </w:p>
+    <w:p>
+      <w:pPr>
+        <w:pStyle w:val="NormalWeb"/>
+        <w:spacing w:before="180" w:beforeAutospacing="0" w:after="180" w:afterAutospacing="0" w:line="480" w:lineRule="auto"/>
+        <w:jc w:val="both"/>
+        <w:rPr>
+          <w:color w:val="444444"/>
+        </w:rPr>
+      </w:pPr>
+      <w:r>
+        <w:rPr>
+          <w:color w:val="444444"/>
+        </w:rPr>
+        <w:t>One important method of disseminating information, especially in healthcare settings, is writing descriptions of findings followed by visual depictions (Melvin et al., 2020). This approach ensures clarity by first providing a detailed narrative that outlines the background, methodology, and key results, enabling readers to understand the context and significance of the data. Developing policy briefs, advocating for changes in practice and policy, and engaging with policymakers can ensure that research findings are translated into real-world impact. </w:t>
+      </w:r>
+    </w:p>
+    <w:p>
+      <w:pPr>
+        <w:pStyle w:val="NormalWeb"/>
+        <w:spacing w:before="180" w:beforeAutospacing="0" w:after="180" w:afterAutospacing="0" w:line="480" w:lineRule="auto"/>
+        <w:jc w:val="both"/>
+        <w:rPr>
+          <w:color w:val="444444"/>
+        </w:rPr>
+      </w:pPr>
+      <w:r>
+        <w:rPr>
+          <w:color w:val="444444"/>
+        </w:rPr>
+        <w:t> </w:t>
+      </w:r>
+    </w:p>
+    <w:p>
+      <w:pPr>
+        <w:pStyle w:val="NormalWeb"/>
+        <w:spacing w:before="180" w:beforeAutospacing="0" w:after="180" w:afterAutospacing="0" w:line="480" w:lineRule="auto"/>
+        <w:jc w:val="both"/>
+        <w:rPr>
+          <w:b/>
+          <w:bCs/>
+          <w:color w:val="444444"/>
+        </w:rPr>
+      </w:pPr>
+      <w:r>
+        <w:rPr>
+          <w:b/>
+          <w:bCs/>
+          <w:color w:val="444444"/>
+        </w:rPr>
+        <w:t>References</w:t>
+      </w:r>
+    </w:p>
+    <w:p>
+      <w:pPr>
+        <w:pStyle w:val="NormalWeb"/>
+        <w:spacing w:before="180" w:beforeAutospacing="0" w:after="180" w:afterAutospacing="0" w:line="480" w:lineRule="auto"/>
+        <w:jc w:val="both"/>
+        <w:rPr>
+          <w:color w:val="444444"/>
+        </w:rPr>
+      </w:pPr>
+      <w:r>
+        <w:rPr>
+          <w:color w:val="444444"/>
+        </w:rPr>
+        <w:t xml:space="preserve">Melvin, C. L., Harvey, J., Pittman, T., </w:t>
+      </w:r>
+      <w:proofErr w:type="spellStart"/>
+      <w:r>
+        <w:rPr>
+          <w:color w:val="444444"/>
+        </w:rPr>
+        <w:t>Gentilin</w:t>
+      </w:r>
+      <w:proofErr w:type="spellEnd"/>
+      <w:r>
+        <w:rPr>
+          <w:color w:val="444444"/>
+        </w:rPr>
+        <w:t xml:space="preserve">, S., </w:t>
+      </w:r>
+      <w:proofErr w:type="spellStart"/>
+      <w:r>
+        <w:rPr>
+          <w:color w:val="444444"/>
+        </w:rPr>
+        <w:t>Burshell</w:t>
+      </w:r>
+      <w:proofErr w:type="spellEnd"/>
+      <w:r>
+        <w:rPr>
+          <w:color w:val="444444"/>
+        </w:rPr>
+        <w:t xml:space="preserve">, D., &amp; Kelechi, T. (2020). Communicating and disseminating research findings to study participants: Formative assessment </w:t>
+      </w:r>
+      <w:r>
+        <w:rPr>
+          <w:color w:val="444444"/>
+        </w:rPr>
+        <w:lastRenderedPageBreak/>
+        <w:t>of participant and researcher expectations and preferences. </w:t>
       </w:r>
       <w:r>
         <w:rPr>
           <w:rStyle w:val="Emphasis"/>
           <w:color w:val="444444"/>
         </w:rPr>
-        <w:t>Responsible dissemination of health and medical research: Some guidance points</w:t>
-      </w:r>
-      <w:r>
-        <w:rPr>
-          <w:color w:val="444444"/>
-        </w:rPr>
-        <w:t>. BMJ evidence-based medicine. https://pmc.ncbi.nlm.nih.gov/articles/PMC10313982/</w:t>
-      </w:r>
+        <w:t>Journal of clinical and translational science</w:t>
+      </w:r>
+      <w:r>
+        <w:rPr>
+          <w:color w:val="444444"/>
+        </w:rPr>
+        <w:t>, </w:t>
+      </w:r>
+      <w:r>
+        <w:rPr>
+          <w:rStyle w:val="Emphasis"/>
+          <w:color w:val="444444"/>
+        </w:rPr>
+        <w:t>4</w:t>
+      </w:r>
+      <w:r>
+        <w:rPr>
+          <w:color w:val="444444"/>
+        </w:rPr>
+        <w:t>(3), 233–242. https://doi.org/10.1017/cts.2020.9</w:t>
+      </w:r>
+    </w:p>
+    <w:p>
+      <w:pPr>
+        <w:pStyle w:val="NormalWeb"/>
+        <w:spacing w:before="180" w:beforeAutospacing="0" w:after="180" w:afterAutospacing="0" w:line="480" w:lineRule="auto"/>
+        <w:rPr>
+          <w:color w:val="444444"/>
+        </w:rPr>
+      </w:pPr>
     </w:p>
     <w:p>
       <w:pPr>
@@ -871,8 +1073,8 @@
       </w:pPr>
     </w:p>
     <w:sectPr>
-      <w:footerReference w:type="even" r:id="rId8"/>
-      <w:footerReference w:type="default" r:id="rId9"/>
+      <w:footerReference w:type="even" r:id="rId9"/>
+      <w:footerReference w:type="default" r:id="rId10"/>
       <w:pgSz w:w="12240" w:h="15840"/>
       <w:pgMar w:top="1440" w:right="1440" w:bottom="1440" w:left="1440" w:header="720" w:footer="720" w:gutter="0"/>
       <w:pgNumType w:start="0"/>

</xml_diff>

<commit_message>
Modification done in files
</commit_message>
<xml_diff>
--- a/WK10_Discussion.docx
+++ b/WK10_Discussion.docx
@@ -77,6 +77,28 @@
             <w:br/>
             <w:t>Walden University</w:t>
           </w:r>
+        </w:p>
+        <w:p>
+          <w:pPr>
+            <w:pStyle w:val="NoSpacing"/>
+            <w:spacing w:after="240" w:line="480" w:lineRule="auto"/>
+            <w:jc w:val="center"/>
+            <w:rPr>
+              <w:rFonts w:ascii="Times New Roman" w:hAnsi="Times New Roman" w:cs="Times New Roman"/>
+              <w:color w:val="000000" w:themeColor="text1"/>
+              <w:sz w:val="48"/>
+              <w:szCs w:val="48"/>
+            </w:rPr>
+          </w:pPr>
+          <w:r>
+            <w:rPr>
+              <w:rFonts w:ascii="Times New Roman" w:hAnsi="Times New Roman" w:cs="Times New Roman"/>
+              <w:color w:val="000000" w:themeColor="text1"/>
+              <w:sz w:val="48"/>
+              <w:szCs w:val="48"/>
+            </w:rPr>
+            <w:t>NURS-6451</w:t>
+          </w:r>
           <w:r>
             <w:rPr>
               <w:rFonts w:ascii="Times New Roman" w:hAnsi="Times New Roman" w:cs="Times New Roman"/>
@@ -152,6 +174,7 @@
     <w:p>
       <w:pPr>
         <w:spacing w:before="180" w:after="180" w:line="480" w:lineRule="auto"/>
+        <w:jc w:val="both"/>
         <w:rPr>
           <w:rFonts w:ascii="Times New Roman" w:eastAsia="Times New Roman" w:hAnsi="Times New Roman" w:cs="Times New Roman"/>
           <w:b/>
@@ -163,6 +186,7 @@
     <w:p>
       <w:pPr>
         <w:spacing w:before="180" w:after="180" w:line="480" w:lineRule="auto"/>
+        <w:jc w:val="both"/>
         <w:rPr>
           <w:rFonts w:ascii="Times New Roman" w:eastAsia="Times New Roman" w:hAnsi="Times New Roman" w:cs="Times New Roman"/>
           <w:b/>
@@ -170,29 +194,25 @@
           <w:color w:val="2D3B45"/>
         </w:rPr>
       </w:pPr>
-    </w:p>
-    <w:p>
-      <w:pPr>
-        <w:spacing w:before="180" w:after="180" w:line="480" w:lineRule="auto"/>
+      <w:r>
         <w:rPr>
           <w:rFonts w:ascii="Times New Roman" w:eastAsia="Times New Roman" w:hAnsi="Times New Roman" w:cs="Times New Roman"/>
           <w:b/>
           <w:bCs/>
           <w:color w:val="2D3B45"/>
         </w:rPr>
-      </w:pPr>
-    </w:p>
-    <w:p>
-      <w:pPr>
-        <w:spacing w:before="180" w:after="180" w:line="480" w:lineRule="auto"/>
-        <w:jc w:val="both"/>
+        <w:lastRenderedPageBreak/>
+        <w:t>Discussion</w:t>
+      </w:r>
+      <w:r>
         <w:rPr>
           <w:rFonts w:ascii="Times New Roman" w:eastAsia="Times New Roman" w:hAnsi="Times New Roman" w:cs="Times New Roman"/>
           <w:b/>
           <w:bCs/>
           <w:color w:val="2D3B45"/>
         </w:rPr>
-      </w:pPr>
+        <w:t xml:space="preserve">: Week </w:t>
+      </w:r>
       <w:r>
         <w:rPr>
           <w:rFonts w:ascii="Times New Roman" w:eastAsia="Times New Roman" w:hAnsi="Times New Roman" w:cs="Times New Roman"/>
@@ -200,18 +220,20 @@
           <w:bCs/>
           <w:color w:val="2D3B45"/>
         </w:rPr>
-        <w:lastRenderedPageBreak/>
-        <w:t>Discussion</w:t>
-      </w:r>
-      <w:r>
+        <w:t>10</w:t>
+      </w:r>
+    </w:p>
+    <w:p>
+      <w:pPr>
+        <w:spacing w:before="180" w:after="180" w:line="480" w:lineRule="auto"/>
+        <w:jc w:val="both"/>
         <w:rPr>
           <w:rFonts w:ascii="Times New Roman" w:eastAsia="Times New Roman" w:hAnsi="Times New Roman" w:cs="Times New Roman"/>
           <w:b/>
           <w:bCs/>
           <w:color w:val="2D3B45"/>
         </w:rPr>
-        <w:t xml:space="preserve">: Week </w:t>
-      </w:r>
+      </w:pPr>
       <w:r>
         <w:rPr>
           <w:rFonts w:ascii="Times New Roman" w:eastAsia="Times New Roman" w:hAnsi="Times New Roman" w:cs="Times New Roman"/>
@@ -219,7 +241,7 @@
           <w:bCs/>
           <w:color w:val="2D3B45"/>
         </w:rPr>
-        <w:t>10</w:t>
+        <w:t>Topic: Dissemination Of Evaluation Findings</w:t>
       </w:r>
     </w:p>
     <w:p>
@@ -362,7 +384,14 @@
         <w:rPr>
           <w:color w:val="444444"/>
         </w:rPr>
-        <w:t>In today’s world, there is high engagement with smartphones, the average smartphone user interacts with their device 60 times, for a total of 117 minutes, per day. Mobile interventions seek to utilize this engagement by using smartphone apps. (Hicks et al., 2023) We can use internal messaging apps to</w:t>
+        <w:t xml:space="preserve">In today’s world, there is high engagement with smartphones, the average smartphone user interacts with their device 60 times, for a total of 117 minutes, per day. Mobile interventions seek to utilize this engagement by using smartphone apps. (Hicks et al., 2023) We can use internal </w:t>
+      </w:r>
+      <w:r>
+        <w:rPr>
+          <w:color w:val="444444"/>
+        </w:rPr>
+        <w:lastRenderedPageBreak/>
+        <w:t>messaging apps to</w:t>
       </w:r>
       <w:r>
         <w:rPr>
@@ -375,14 +404,7 @@
         <w:rPr>
           <w:color w:val="444444"/>
         </w:rPr>
-        <w:t xml:space="preserve">share concise updates, infographics, or video summaries and secure messaging </w:t>
-      </w:r>
-      <w:r>
-        <w:rPr>
-          <w:color w:val="444444"/>
-        </w:rPr>
-        <w:lastRenderedPageBreak/>
-        <w:t>apps to allow nurses and staff to access the information at their convenience. This is ideal for busy clinical environments where attending meetings may not always be possible. Distributing mobile-optimized reports or linking to dashboards through email or QR codes posted in common areas such as staff lounges, or bathrooms ensures easy access to key findings. Dashboards can include real-time updates, graphs, or recommendations. It is an appropriate method as the staff can review information during a task or offsite, saves time and resources and instant updates can be sent when new findings or changes occur.</w:t>
+        <w:t>share concise updates, infographics, or video summaries and secure messaging apps to allow nurses and staff to access the information at their convenience. This is ideal for busy clinical environments where attending meetings may not always be possible. Distributing mobile-optimized reports or linking to dashboards through email or QR codes posted in common areas such as staff lounges, or bathrooms ensures easy access to key findings. Dashboards can include real-time updates, graphs, or recommendations. It is an appropriate method as the staff can review information during a task or offsite, saves time and resources and instant updates can be sent when new findings or changes occur.</w:t>
       </w:r>
     </w:p>
     <w:p>
@@ -479,6 +501,7 @@
         <w:rPr>
           <w:color w:val="444444"/>
         </w:rPr>
+        <w:lastRenderedPageBreak/>
         <w:t xml:space="preserve">Hicks, J. L., Boswell, M. A., </w:t>
       </w:r>
       <w:proofErr w:type="spellStart"/>
@@ -528,15 +551,7 @@
           <w:rStyle w:val="Emphasis"/>
           <w:color w:val="444444"/>
         </w:rPr>
-        <w:t xml:space="preserve">Leveraging Mobile </w:t>
-      </w:r>
-      <w:r>
-        <w:rPr>
-          <w:rStyle w:val="Emphasis"/>
-          <w:color w:val="444444"/>
-        </w:rPr>
-        <w:lastRenderedPageBreak/>
-        <w:t>Technology for Public Health Promotion: A Multidisciplinary Perspective</w:t>
+        <w:t>Leveraging Mobile Technology for Public Health Promotion: A Multidisciplinary Perspective</w:t>
       </w:r>
       <w:r>
         <w:rPr>
@@ -755,7 +770,14 @@
         <w:rPr>
           <w:color w:val="444444"/>
         </w:rPr>
-        <w:t xml:space="preserve"> supporting data-driven decision-making. It caters to both analytical and visual learners and ensures critical insights are retained. Moreover, it is a versatile format that can be distributed digitally or in print, increasing its reach and accessibility in a timely, comprehensive, accurate, unbiased, unambiguous, and transparent manner (</w:t>
+        <w:t xml:space="preserve"> supporting data-driven decision-making. It caters to both analytical and visual learners and ensures critical insights are retained. Moreover, it is a versatile format that can be distributed digitally or in print, increasing </w:t>
+      </w:r>
+      <w:r>
+        <w:rPr>
+          <w:color w:val="444444"/>
+        </w:rPr>
+        <w:lastRenderedPageBreak/>
+        <w:t>its reach and accessibility in a timely, comprehensive, accurate, unbiased, unambiguous, and transparent manner (</w:t>
       </w:r>
       <w:proofErr w:type="spellStart"/>
       <w:r>
@@ -785,7 +807,6 @@
         <w:rPr>
           <w:color w:val="444444"/>
         </w:rPr>
-        <w:lastRenderedPageBreak/>
         <w:t>References:</w:t>
       </w:r>
     </w:p>
@@ -969,6 +990,7 @@
         <w:rPr>
           <w:color w:val="444444"/>
         </w:rPr>
+        <w:lastRenderedPageBreak/>
         <w:t xml:space="preserve">Melvin, C. L., Harvey, J., Pittman, T., </w:t>
       </w:r>
       <w:proofErr w:type="spellStart"/>
@@ -997,14 +1019,7 @@
         <w:rPr>
           <w:color w:val="444444"/>
         </w:rPr>
-        <w:t xml:space="preserve">, D., &amp; Kelechi, T. (2020). Communicating and disseminating research findings to study participants: Formative assessment </w:t>
-      </w:r>
-      <w:r>
-        <w:rPr>
-          <w:color w:val="444444"/>
-        </w:rPr>
-        <w:lastRenderedPageBreak/>
-        <w:t>of participant and researcher expectations and preferences. </w:t>
+        <w:t>, D., &amp; Kelechi, T. (2020). Communicating and disseminating research findings to study participants: Formative assessment of participant and researcher expectations and preferences. </w:t>
       </w:r>
       <w:r>
         <w:rPr>

</xml_diff>